<commit_message>
Fix bug: Missing Pixel
</commit_message>
<xml_diff>
--- a/Exam.docx
+++ b/Exam.docx
@@ -2,16 +2,22 @@
 <file path=word/document.xml><?xml version="1.0" encoding="utf-8"?>
 <w:document xmlns:wpc="http://schemas.microsoft.com/office/word/2010/wordprocessingCanvas" xmlns:cx="http://schemas.microsoft.com/office/drawing/2014/chartex" xmlns:cx1="http://schemas.microsoft.com/office/drawing/2015/9/8/chartex" xmlns:cx2="http://schemas.microsoft.com/office/drawing/2015/10/21/chartex" xmlns:cx3="http://schemas.microsoft.com/office/drawing/2016/5/9/chartex" xmlns:cx4="http://schemas.microsoft.com/office/drawing/2016/5/10/chartex" xmlns:cx5="http://schemas.microsoft.com/office/drawing/2016/5/11/chartex" xmlns:cx6="http://schemas.microsoft.com/office/drawing/2016/5/12/chartex" xmlns:cx7="http://schemas.microsoft.com/office/drawing/2016/5/13/chartex" xmlns:cx8="http://schemas.microsoft.com/office/drawing/2016/5/14/chartex" xmlns:mc="http://schemas.openxmlformats.org/markup-compatibility/2006" xmlns:aink="http://schemas.microsoft.com/office/drawing/2016/ink" xmlns:am3d="http://schemas.microsoft.com/office/drawing/2017/model3d" xmlns:o="urn:schemas-microsoft-com:office:office" xmlns:oel="http://schemas.microsoft.com/office/2019/extlst" xmlns:r="http://schemas.openxmlformats.org/officeDocument/2006/relationships" xmlns:m="http://schemas.openxmlformats.org/officeDocument/2006/math" xmlns:v="urn:schemas-microsoft-com:vml" xmlns:wp14="http://schemas.microsoft.com/office/word/2010/wordprocessingDrawing" xmlns:wp="http://schemas.openxmlformats.org/drawingml/2006/wordprocessingDrawing" xmlns:w10="urn:schemas-microsoft-com:office:word" xmlns:w="http://schemas.openxmlformats.org/wordprocessingml/2006/main" xmlns:w14="http://schemas.microsoft.com/office/word/2010/wordml" xmlns:w15="http://schemas.microsoft.com/office/word/2012/wordml" xmlns:w16cex="http://schemas.microsoft.com/office/word/2018/wordml/cex" xmlns:w16cid="http://schemas.microsoft.com/office/word/2016/wordml/cid" xmlns:w16="http://schemas.microsoft.com/office/word/2018/wordml" xmlns:w16du="http://schemas.microsoft.com/office/word/2023/wordml/word16du" xmlns:w16sdtdh="http://schemas.microsoft.com/office/word/2020/wordml/sdtdatahash" xmlns:w16sdtfl="http://schemas.microsoft.com/office/word/2024/wordml/sdtformatlock" xmlns:w16se="http://schemas.microsoft.com/office/word/2015/wordml/symex" xmlns:wpg="http://schemas.microsoft.com/office/word/2010/wordprocessingGroup" xmlns:wpi="http://schemas.microsoft.com/office/word/2010/wordprocessingInk" xmlns:wne="http://schemas.microsoft.com/office/word/2006/wordml" xmlns:wps="http://schemas.microsoft.com/office/word/2010/wordprocessingShape" mc:Ignorable="w14 w15 w16se w16cid w16 w16cex w16sdtdh w16sdtfl w16du wp14">
   <w:body>
+    <w:p/>
+    <w:p>
+      <w:r>
+        <w:t>Kết quả khi thực hiện Median filter với Python:</w:t>
+      </w:r>
+    </w:p>
     <w:p>
       <w:r>
         <w:rPr>
           <w:noProof/>
         </w:rPr>
         <w:drawing>
-          <wp:inline distT="0" distB="0" distL="0" distR="0" wp14:anchorId="29633A76" wp14:editId="22153614">
-            <wp:extent cx="4095750" cy="5276850"/>
-            <wp:effectExtent l="0" t="0" r="0" b="0"/>
-            <wp:docPr id="489077948" name="Picture 1"/>
+          <wp:inline distT="0" distB="0" distL="0" distR="0" wp14:anchorId="4D55B495" wp14:editId="7AEF5C17">
+            <wp:extent cx="4092575" cy="5276215"/>
+            <wp:effectExtent l="0" t="0" r="3175" b="635"/>
+            <wp:docPr id="1206179845" name="Picture 1" descr="A close-up of a person&#10;&#10;AI-generated content may be incorrect."/>
             <wp:cNvGraphicFramePr>
               <a:graphicFrameLocks xmlns:a="http://schemas.openxmlformats.org/drawingml/2006/main" noChangeAspect="1"/>
             </wp:cNvGraphicFramePr>
@@ -19,7 +25,7 @@
               <a:graphicData uri="http://schemas.openxmlformats.org/drawingml/2006/picture">
                 <pic:pic xmlns:pic="http://schemas.openxmlformats.org/drawingml/2006/picture">
                   <pic:nvPicPr>
-                    <pic:cNvPr id="0" name="Picture 1"/>
+                    <pic:cNvPr id="1206179845" name="Picture 1" descr="A close-up of a person&#10;&#10;AI-generated content may be incorrect."/>
                     <pic:cNvPicPr>
                       <a:picLocks noChangeAspect="1" noChangeArrowheads="1"/>
                     </pic:cNvPicPr>
@@ -40,7 +46,7 @@
                   <pic:spPr bwMode="auto">
                     <a:xfrm>
                       <a:off x="0" y="0"/>
-                      <a:ext cx="4095750" cy="5276850"/>
+                      <a:ext cx="4092575" cy="5276215"/>
                     </a:xfrm>
                     <a:prstGeom prst="rect">
                       <a:avLst/>
@@ -57,6 +63,29 @@
         </w:drawing>
       </w:r>
     </w:p>
+    <w:p/>
+    <w:p/>
+    <w:p/>
+    <w:p/>
+    <w:p/>
+    <w:p/>
+    <w:p/>
+    <w:p/>
+    <w:p>
+      <w:r>
+        <w:lastRenderedPageBreak/>
+        <w:t>Kết quả khi thực hiện Median filter với Verilog:</w:t>
+      </w:r>
+    </w:p>
+    <w:p>
+      <w:pPr>
+        <w:ind w:left="0" w:firstLine="0"/>
+      </w:pPr>
+      <w:r>
+        <w:tab/>
+      </w:r>
+    </w:p>
+    <w:p/>
     <w:sectPr>
       <w:pgSz w:w="12240" w:h="15840"/>
       <w:pgMar w:top="1440" w:right="1440" w:bottom="1440" w:left="1440" w:header="720" w:footer="720" w:gutter="0"/>
@@ -468,6 +497,7 @@
   <w:style w:type="paragraph" w:default="1" w:styleId="Normal">
     <w:name w:val="Normal"/>
     <w:qFormat/>
+    <w:rsid w:val="000142CC"/>
   </w:style>
   <w:style w:type="paragraph" w:styleId="Heading1">
     <w:name w:val="heading 1"/>
@@ -476,7 +506,7 @@
     <w:link w:val="Heading1Char"/>
     <w:uiPriority w:val="9"/>
     <w:qFormat/>
-    <w:rsid w:val="005D54EA"/>
+    <w:rsid w:val="00C4201F"/>
     <w:pPr>
       <w:keepNext/>
       <w:keepLines/>
@@ -499,7 +529,7 @@
     <w:semiHidden/>
     <w:unhideWhenUsed/>
     <w:qFormat/>
-    <w:rsid w:val="005D54EA"/>
+    <w:rsid w:val="00C4201F"/>
     <w:pPr>
       <w:keepNext/>
       <w:keepLines/>
@@ -522,7 +552,7 @@
     <w:semiHidden/>
     <w:unhideWhenUsed/>
     <w:qFormat/>
-    <w:rsid w:val="005D54EA"/>
+    <w:rsid w:val="00C4201F"/>
     <w:pPr>
       <w:keepNext/>
       <w:keepLines/>
@@ -545,7 +575,7 @@
     <w:semiHidden/>
     <w:unhideWhenUsed/>
     <w:qFormat/>
-    <w:rsid w:val="005D54EA"/>
+    <w:rsid w:val="00C4201F"/>
     <w:pPr>
       <w:keepNext/>
       <w:keepLines/>
@@ -568,7 +598,7 @@
     <w:semiHidden/>
     <w:unhideWhenUsed/>
     <w:qFormat/>
-    <w:rsid w:val="005D54EA"/>
+    <w:rsid w:val="00C4201F"/>
     <w:pPr>
       <w:keepNext/>
       <w:keepLines/>
@@ -589,7 +619,7 @@
     <w:semiHidden/>
     <w:unhideWhenUsed/>
     <w:qFormat/>
-    <w:rsid w:val="005D54EA"/>
+    <w:rsid w:val="00C4201F"/>
     <w:pPr>
       <w:keepNext/>
       <w:keepLines/>
@@ -612,7 +642,7 @@
     <w:semiHidden/>
     <w:unhideWhenUsed/>
     <w:qFormat/>
-    <w:rsid w:val="005D54EA"/>
+    <w:rsid w:val="00C4201F"/>
     <w:pPr>
       <w:keepNext/>
       <w:keepLines/>
@@ -633,7 +663,7 @@
     <w:semiHidden/>
     <w:unhideWhenUsed/>
     <w:qFormat/>
-    <w:rsid w:val="005D54EA"/>
+    <w:rsid w:val="00C4201F"/>
     <w:pPr>
       <w:keepNext/>
       <w:keepLines/>
@@ -656,7 +686,7 @@
     <w:semiHidden/>
     <w:unhideWhenUsed/>
     <w:qFormat/>
-    <w:rsid w:val="005D54EA"/>
+    <w:rsid w:val="00C4201F"/>
     <w:pPr>
       <w:keepNext/>
       <w:keepLines/>
@@ -700,7 +730,7 @@
     <w:basedOn w:val="DefaultParagraphFont"/>
     <w:link w:val="Heading1"/>
     <w:uiPriority w:val="9"/>
-    <w:rsid w:val="005D54EA"/>
+    <w:rsid w:val="00C4201F"/>
     <w:rPr>
       <w:rFonts w:asciiTheme="majorHAnsi" w:eastAsiaTheme="majorEastAsia" w:hAnsiTheme="majorHAnsi" w:cstheme="majorBidi"/>
       <w:color w:val="0F4761" w:themeColor="accent1" w:themeShade="BF"/>
@@ -714,7 +744,7 @@
     <w:link w:val="Heading2"/>
     <w:uiPriority w:val="9"/>
     <w:semiHidden/>
-    <w:rsid w:val="005D54EA"/>
+    <w:rsid w:val="00C4201F"/>
     <w:rPr>
       <w:rFonts w:asciiTheme="majorHAnsi" w:eastAsiaTheme="majorEastAsia" w:hAnsiTheme="majorHAnsi" w:cstheme="majorBidi"/>
       <w:color w:val="0F4761" w:themeColor="accent1" w:themeShade="BF"/>
@@ -728,7 +758,7 @@
     <w:link w:val="Heading3"/>
     <w:uiPriority w:val="9"/>
     <w:semiHidden/>
-    <w:rsid w:val="005D54EA"/>
+    <w:rsid w:val="00C4201F"/>
     <w:rPr>
       <w:rFonts w:asciiTheme="minorHAnsi" w:eastAsiaTheme="majorEastAsia" w:hAnsiTheme="minorHAnsi" w:cstheme="majorBidi"/>
       <w:color w:val="0F4761" w:themeColor="accent1" w:themeShade="BF"/>
@@ -742,7 +772,7 @@
     <w:link w:val="Heading4"/>
     <w:uiPriority w:val="9"/>
     <w:semiHidden/>
-    <w:rsid w:val="005D54EA"/>
+    <w:rsid w:val="00C4201F"/>
     <w:rPr>
       <w:rFonts w:asciiTheme="minorHAnsi" w:eastAsiaTheme="majorEastAsia" w:hAnsiTheme="minorHAnsi" w:cstheme="majorBidi"/>
       <w:i/>
@@ -756,7 +786,7 @@
     <w:link w:val="Heading5"/>
     <w:uiPriority w:val="9"/>
     <w:semiHidden/>
-    <w:rsid w:val="005D54EA"/>
+    <w:rsid w:val="00C4201F"/>
     <w:rPr>
       <w:rFonts w:asciiTheme="minorHAnsi" w:eastAsiaTheme="majorEastAsia" w:hAnsiTheme="minorHAnsi" w:cstheme="majorBidi"/>
       <w:color w:val="0F4761" w:themeColor="accent1" w:themeShade="BF"/>
@@ -768,7 +798,7 @@
     <w:link w:val="Heading6"/>
     <w:uiPriority w:val="9"/>
     <w:semiHidden/>
-    <w:rsid w:val="005D54EA"/>
+    <w:rsid w:val="00C4201F"/>
     <w:rPr>
       <w:rFonts w:asciiTheme="minorHAnsi" w:eastAsiaTheme="majorEastAsia" w:hAnsiTheme="minorHAnsi" w:cstheme="majorBidi"/>
       <w:i/>
@@ -782,7 +812,7 @@
     <w:link w:val="Heading7"/>
     <w:uiPriority w:val="9"/>
     <w:semiHidden/>
-    <w:rsid w:val="005D54EA"/>
+    <w:rsid w:val="00C4201F"/>
     <w:rPr>
       <w:rFonts w:asciiTheme="minorHAnsi" w:eastAsiaTheme="majorEastAsia" w:hAnsiTheme="minorHAnsi" w:cstheme="majorBidi"/>
       <w:color w:val="595959" w:themeColor="text1" w:themeTint="A6"/>
@@ -794,7 +824,7 @@
     <w:link w:val="Heading8"/>
     <w:uiPriority w:val="9"/>
     <w:semiHidden/>
-    <w:rsid w:val="005D54EA"/>
+    <w:rsid w:val="00C4201F"/>
     <w:rPr>
       <w:rFonts w:asciiTheme="minorHAnsi" w:eastAsiaTheme="majorEastAsia" w:hAnsiTheme="minorHAnsi" w:cstheme="majorBidi"/>
       <w:i/>
@@ -808,7 +838,7 @@
     <w:link w:val="Heading9"/>
     <w:uiPriority w:val="9"/>
     <w:semiHidden/>
-    <w:rsid w:val="005D54EA"/>
+    <w:rsid w:val="00C4201F"/>
     <w:rPr>
       <w:rFonts w:asciiTheme="minorHAnsi" w:eastAsiaTheme="majorEastAsia" w:hAnsiTheme="minorHAnsi" w:cstheme="majorBidi"/>
       <w:color w:val="272727" w:themeColor="text1" w:themeTint="D8"/>
@@ -821,7 +851,7 @@
     <w:link w:val="TitleChar"/>
     <w:uiPriority w:val="10"/>
     <w:qFormat/>
-    <w:rsid w:val="005D54EA"/>
+    <w:rsid w:val="00C4201F"/>
     <w:pPr>
       <w:spacing w:after="80" w:line="240" w:lineRule="auto"/>
       <w:contextualSpacing/>
@@ -839,7 +869,7 @@
     <w:basedOn w:val="DefaultParagraphFont"/>
     <w:link w:val="Title"/>
     <w:uiPriority w:val="10"/>
-    <w:rsid w:val="005D54EA"/>
+    <w:rsid w:val="00C4201F"/>
     <w:rPr>
       <w:rFonts w:asciiTheme="majorHAnsi" w:eastAsiaTheme="majorEastAsia" w:hAnsiTheme="majorHAnsi" w:cstheme="majorBidi"/>
       <w:spacing w:val="-10"/>
@@ -855,7 +885,7 @@
     <w:link w:val="SubtitleChar"/>
     <w:uiPriority w:val="11"/>
     <w:qFormat/>
-    <w:rsid w:val="005D54EA"/>
+    <w:rsid w:val="00C4201F"/>
     <w:pPr>
       <w:numPr>
         <w:ilvl w:val="1"/>
@@ -875,7 +905,7 @@
     <w:basedOn w:val="DefaultParagraphFont"/>
     <w:link w:val="Subtitle"/>
     <w:uiPriority w:val="11"/>
-    <w:rsid w:val="005D54EA"/>
+    <w:rsid w:val="00C4201F"/>
     <w:rPr>
       <w:rFonts w:asciiTheme="minorHAnsi" w:eastAsiaTheme="majorEastAsia" w:hAnsiTheme="minorHAnsi" w:cstheme="majorBidi"/>
       <w:color w:val="595959" w:themeColor="text1" w:themeTint="A6"/>
@@ -891,7 +921,7 @@
     <w:link w:val="QuoteChar"/>
     <w:uiPriority w:val="29"/>
     <w:qFormat/>
-    <w:rsid w:val="005D54EA"/>
+    <w:rsid w:val="00C4201F"/>
     <w:pPr>
       <w:spacing w:before="160"/>
       <w:jc w:val="center"/>
@@ -907,7 +937,7 @@
     <w:basedOn w:val="DefaultParagraphFont"/>
     <w:link w:val="Quote"/>
     <w:uiPriority w:val="29"/>
-    <w:rsid w:val="005D54EA"/>
+    <w:rsid w:val="00C4201F"/>
     <w:rPr>
       <w:i/>
       <w:iCs/>
@@ -919,7 +949,7 @@
     <w:basedOn w:val="Normal"/>
     <w:uiPriority w:val="34"/>
     <w:qFormat/>
-    <w:rsid w:val="005D54EA"/>
+    <w:rsid w:val="00C4201F"/>
     <w:pPr>
       <w:ind w:left="720"/>
       <w:contextualSpacing/>
@@ -930,7 +960,7 @@
     <w:basedOn w:val="DefaultParagraphFont"/>
     <w:uiPriority w:val="21"/>
     <w:qFormat/>
-    <w:rsid w:val="005D54EA"/>
+    <w:rsid w:val="00C4201F"/>
     <w:rPr>
       <w:i/>
       <w:iCs/>
@@ -944,7 +974,7 @@
     <w:link w:val="IntenseQuoteChar"/>
     <w:uiPriority w:val="30"/>
     <w:qFormat/>
-    <w:rsid w:val="005D54EA"/>
+    <w:rsid w:val="00C4201F"/>
     <w:pPr>
       <w:pBdr>
         <w:top w:val="single" w:sz="4" w:space="10" w:color="0F4761" w:themeColor="accent1" w:themeShade="BF"/>
@@ -965,7 +995,7 @@
     <w:basedOn w:val="DefaultParagraphFont"/>
     <w:link w:val="IntenseQuote"/>
     <w:uiPriority w:val="30"/>
-    <w:rsid w:val="005D54EA"/>
+    <w:rsid w:val="00C4201F"/>
     <w:rPr>
       <w:i/>
       <w:iCs/>
@@ -977,7 +1007,7 @@
     <w:basedOn w:val="DefaultParagraphFont"/>
     <w:uiPriority w:val="32"/>
     <w:qFormat/>
-    <w:rsid w:val="005D54EA"/>
+    <w:rsid w:val="00C4201F"/>
     <w:rPr>
       <w:b/>
       <w:bCs/>

</xml_diff>